<commit_message>
Java basic chapter labs completed
</commit_message>
<xml_diff>
--- a/EG 01-Java Basics getting started.docx
+++ b/EG 01-Java Basics getting started.docx
@@ -421,6 +421,16 @@
     <w:p>
       <w:pPr>
         <w:pStyle w:val="Numberlist"/>
+        <w:numPr>
+          <w:ilvl w:val="0"/>
+          <w:numId w:val="0"/>
+        </w:numPr>
+        <w:ind w:left="851"/>
+      </w:pPr>
+    </w:p>
+    <w:p>
+      <w:pPr>
+        <w:pStyle w:val="Numberlist"/>
       </w:pPr>
       <w:r>
         <w:t>Type the following project name. If the default location is the one you want to use, leave it as it is; otherwise, uncheck ‘Use default location’ and enter your choice of folder. Accept the other default settings:</w:t>
@@ -498,9 +508,19 @@
     <w:p>
       <w:pPr>
         <w:pStyle w:val="Numberlist"/>
-      </w:pPr>
-      <w:r>
-        <w:t xml:space="preserve"> Select </w:t>
+        <w:numPr>
+          <w:ilvl w:val="0"/>
+          <w:numId w:val="0"/>
+        </w:numPr>
+        <w:ind w:left="851"/>
+      </w:pPr>
+    </w:p>
+    <w:p>
+      <w:pPr>
+        <w:pStyle w:val="Numberlist"/>
+      </w:pPr>
+      <w:r>
+        <w:t xml:space="preserve">Select </w:t>
       </w:r>
       <w:r>
         <w:t>‘</w:t>
@@ -575,39 +595,21 @@
           <w:b/>
           <w:bCs/>
         </w:rPr>
-        <w:t xml:space="preserve">public </w:t>
-      </w:r>
-      <w:proofErr w:type="spellStart"/>
+        <w:t>public static</w:t>
+      </w:r>
       <w:r>
         <w:rPr>
           <w:b/>
           <w:bCs/>
         </w:rPr>
-        <w:t>static_void</w:t>
-      </w:r>
-      <w:proofErr w:type="spellEnd"/>
+        <w:t xml:space="preserve"> </w:t>
+      </w:r>
       <w:r>
         <w:rPr>
           <w:b/>
           <w:bCs/>
         </w:rPr>
-        <w:t xml:space="preserve"> main(String[] </w:t>
-      </w:r>
-      <w:proofErr w:type="spellStart"/>
-      <w:r>
-        <w:rPr>
-          <w:b/>
-          <w:bCs/>
-        </w:rPr>
-        <w:t>args</w:t>
-      </w:r>
-      <w:proofErr w:type="spellEnd"/>
-      <w:r>
-        <w:rPr>
-          <w:b/>
-          <w:bCs/>
-        </w:rPr>
-        <w:t>)</w:t>
+        <w:t>void main(String[] args)</w:t>
       </w:r>
       <w:r>
         <w:t>.</w:t>
@@ -751,7 +753,7 @@
         <w:pStyle w:val="NormalWeb"/>
         <w:shd w:val="clear" w:color="auto" w:fill="FFFFFF"/>
         <w:spacing w:before="0" w:line="240" w:lineRule="auto"/>
-        <w:ind w:left="1077"/>
+        <w:ind w:left="720" w:firstLine="131"/>
         <w:rPr>
           <w:rFonts w:ascii="Consolas" w:eastAsia="Times New Roman" w:hAnsi="Consolas" w:cs="Courier New"/>
           <w:color w:val="000000"/>
@@ -907,7 +909,6 @@
         </w:rPr>
         <w:t xml:space="preserve"> main(String[] </w:t>
       </w:r>
-      <w:proofErr w:type="spellStart"/>
       <w:r>
         <w:rPr>
           <w:rFonts w:ascii="Consolas" w:eastAsia="Times New Roman" w:hAnsi="Consolas" w:cs="Courier New"/>
@@ -916,7 +917,6 @@
         </w:rPr>
         <w:t>args</w:t>
       </w:r>
-      <w:proofErr w:type="spellEnd"/>
       <w:r>
         <w:rPr>
           <w:rFonts w:ascii="Consolas" w:eastAsia="Times New Roman" w:hAnsi="Consolas" w:cs="Courier New"/>
@@ -943,16 +943,7 @@
           <w:color w:val="000000"/>
           <w:lang w:eastAsia="en-GB"/>
         </w:rPr>
-        <w:t xml:space="preserve">                  </w:t>
-      </w:r>
-      <w:proofErr w:type="spellStart"/>
-      <w:r>
-        <w:rPr>
-          <w:rFonts w:ascii="Consolas" w:eastAsia="Times New Roman" w:hAnsi="Consolas" w:cs="Courier New"/>
-          <w:color w:val="000000"/>
-          <w:lang w:eastAsia="en-GB"/>
-        </w:rPr>
-        <w:t>System.</w:t>
+        <w:t xml:space="preserve">                  System.</w:t>
       </w:r>
       <w:r>
         <w:rPr>
@@ -972,32 +963,43 @@
           <w:color w:val="000000"/>
           <w:lang w:eastAsia="en-GB"/>
         </w:rPr>
-        <w:t>.println</w:t>
-      </w:r>
-      <w:proofErr w:type="spellEnd"/>
+        <w:t>.println(</w:t>
+      </w:r>
+      <w:r>
+        <w:rPr>
+          <w:rFonts w:ascii="Consolas" w:eastAsia="Times New Roman" w:hAnsi="Consolas" w:cs="Courier New"/>
+          <w:color w:val="2A00FF"/>
+          <w:lang w:eastAsia="en-GB"/>
+        </w:rPr>
+        <w:t>"Hello, world!"</w:t>
+      </w:r>
       <w:r>
         <w:rPr>
           <w:rFonts w:ascii="Consolas" w:eastAsia="Times New Roman" w:hAnsi="Consolas" w:cs="Courier New"/>
           <w:color w:val="000000"/>
           <w:lang w:eastAsia="en-GB"/>
         </w:rPr>
-        <w:t>(</w:t>
-      </w:r>
-      <w:r>
-        <w:rPr>
-          <w:rFonts w:ascii="Consolas" w:eastAsia="Times New Roman" w:hAnsi="Consolas" w:cs="Courier New"/>
-          <w:color w:val="2A00FF"/>
-          <w:lang w:eastAsia="en-GB"/>
-        </w:rPr>
-        <w:t>"Hello, world!"</w:t>
-      </w:r>
-      <w:r>
+        <w:t>);</w:t>
+      </w:r>
+    </w:p>
+    <w:p>
+      <w:pPr>
+        <w:shd w:val="clear" w:color="auto" w:fill="FFFFFF"/>
+        <w:spacing w:before="0" w:line="240" w:lineRule="auto"/>
+        <w:ind w:left="10"/>
         <w:rPr>
           <w:rFonts w:ascii="Consolas" w:eastAsia="Times New Roman" w:hAnsi="Consolas" w:cs="Courier New"/>
           <w:color w:val="000000"/>
           <w:lang w:eastAsia="en-GB"/>
         </w:rPr>
-        <w:t>);</w:t>
+      </w:pPr>
+      <w:r>
+        <w:rPr>
+          <w:rFonts w:ascii="Consolas" w:eastAsia="Times New Roman" w:hAnsi="Consolas" w:cs="Courier New"/>
+          <w:color w:val="000000"/>
+          <w:lang w:eastAsia="en-GB"/>
+        </w:rPr>
+        <w:t xml:space="preserve">              }</w:t>
       </w:r>
     </w:p>
     <w:p>
@@ -1017,26 +1019,6 @@
           <w:color w:val="000000"/>
           <w:lang w:eastAsia="en-GB"/>
         </w:rPr>
-        <w:t xml:space="preserve">              }</w:t>
-      </w:r>
-    </w:p>
-    <w:p>
-      <w:pPr>
-        <w:shd w:val="clear" w:color="auto" w:fill="FFFFFF"/>
-        <w:spacing w:before="0" w:line="240" w:lineRule="auto"/>
-        <w:ind w:left="10"/>
-        <w:rPr>
-          <w:rFonts w:ascii="Consolas" w:eastAsia="Times New Roman" w:hAnsi="Consolas" w:cs="Courier New"/>
-          <w:color w:val="000000"/>
-          <w:lang w:eastAsia="en-GB"/>
-        </w:rPr>
-      </w:pPr>
-      <w:r>
-        <w:rPr>
-          <w:rFonts w:ascii="Consolas" w:eastAsia="Times New Roman" w:hAnsi="Consolas" w:cs="Courier New"/>
-          <w:color w:val="000000"/>
-          <w:lang w:eastAsia="en-GB"/>
-        </w:rPr>
         <w:t xml:space="preserve">       }</w:t>
       </w:r>
     </w:p>
@@ -1058,27 +1040,34 @@
         </w:rPr>
         <w:t xml:space="preserve"> Type </w:t>
       </w:r>
-      <w:proofErr w:type="spellStart"/>
       <w:r>
         <w:rPr>
           <w:rStyle w:val="NumberlistChar"/>
           <w:rFonts w:ascii="Courier New" w:hAnsi="Courier New" w:cs="Courier New"/>
           <w:b/>
           <w:bCs/>
+          <w:sz w:val="28"/>
+          <w:szCs w:val="28"/>
         </w:rPr>
         <w:t>syso</w:t>
       </w:r>
-      <w:proofErr w:type="spellEnd"/>
       <w:r>
         <w:rPr>
           <w:rStyle w:val="NumberlistChar"/>
-        </w:rPr>
-        <w:t xml:space="preserve"> followed by Ctrl-Space to type</w:t>
-      </w:r>
-      <w:r>
+          <w:sz w:val="26"/>
+          <w:szCs w:val="28"/>
+        </w:rPr>
         <w:t xml:space="preserve"> </w:t>
       </w:r>
-      <w:proofErr w:type="spellStart"/>
+      <w:r>
+        <w:rPr>
+          <w:rStyle w:val="NumberlistChar"/>
+        </w:rPr>
+        <w:t>followed by Ctrl-Space to type</w:t>
+      </w:r>
+      <w:r>
+        <w:t xml:space="preserve"> </w:t>
+      </w:r>
       <w:r>
         <w:rPr>
           <w:rFonts w:ascii="Courier New" w:eastAsia="Times New Roman" w:hAnsi="Courier New" w:cs="Courier New"/>
@@ -1109,7 +1098,6 @@
         </w:rPr>
         <w:t>.println</w:t>
       </w:r>
-      <w:proofErr w:type="spellEnd"/>
       <w:r>
         <w:t xml:space="preserve"> </w:t>
       </w:r>
@@ -1194,7 +1182,6 @@
         <w:br/>
         <w:t xml:space="preserve">Please view the output for the </w:t>
       </w:r>
-      <w:proofErr w:type="spellStart"/>
       <w:r>
         <w:rPr>
           <w:b/>
@@ -1203,7 +1190,6 @@
         </w:rPr>
         <w:t>println</w:t>
       </w:r>
-      <w:proofErr w:type="spellEnd"/>
       <w:r>
         <w:t xml:space="preserve"> messages.</w:t>
       </w:r>
@@ -1221,50 +1207,110 @@
     </w:p>
     <w:p>
       <w:pPr>
-        <w:spacing w:before="0" w:after="160" w:line="259" w:lineRule="auto"/>
+        <w:pStyle w:val="Heading2"/>
+      </w:pPr>
+      <w:r>
+        <w:br w:type="page"/>
+      </w:r>
+      <w:r>
+        <w:lastRenderedPageBreak/>
+        <w:t>Building and running the program using command line</w:t>
+      </w:r>
+    </w:p>
+    <w:p>
+      <w:pPr>
+        <w:pStyle w:val="Tableheading2"/>
+      </w:pPr>
+    </w:p>
+    <w:p>
+      <w:r>
+        <w:rPr>
+          <w:lang w:val="en-US"/>
+        </w:rPr>
+        <w:t>In this part you will deploy a simple Java app but the procedure is the same for a larger apps</w:t>
+      </w:r>
+      <w:r>
+        <w:rPr>
+          <w:lang w:val="en-US"/>
+        </w:rPr>
+        <w:t xml:space="preserve"> through to production:  </w:t>
+      </w:r>
+      <w:r>
         <w:rPr>
           <w:b/>
           <w:bCs/>
-          <w:sz w:val="28"/>
+          <w:sz w:val="26"/>
           <w:szCs w:val="28"/>
-        </w:rPr>
-      </w:pPr>
-      <w:r>
-        <w:br w:type="page"/>
-      </w:r>
-    </w:p>
-    <w:p>
-      <w:pPr>
-        <w:pStyle w:val="Heading2"/>
-      </w:pPr>
-      <w:r>
-        <w:lastRenderedPageBreak/>
-        <w:t>Building and running the program using command line</w:t>
-      </w:r>
-    </w:p>
-    <w:p>
-      <w:pPr>
-        <w:pStyle w:val="Heading2"/>
-      </w:pPr>
-      <w:r>
-        <w:t xml:space="preserve">From </w:t>
-      </w:r>
-      <w:r>
-        <w:t xml:space="preserve">Development → Staging → Production </w:t>
-      </w:r>
-    </w:p>
-    <w:p>
-      <w:r>
-        <w:rPr>
           <w:lang w:val="en-US"/>
         </w:rPr>
-        <w:t>In this part you will deploy a simple Java app but the procedure is the same for a larger apps.</w:t>
-      </w:r>
-      <w:r>
-        <w:rPr>
+        <w:t xml:space="preserve">Develop </w:t>
+      </w:r>
+      <w:r>
+        <w:rPr>
+          <w:b/>
+          <w:bCs/>
+          <w:sz w:val="26"/>
+          <w:szCs w:val="28"/>
+        </w:rPr>
+        <w:t xml:space="preserve">→ </w:t>
+      </w:r>
+      <w:r>
+        <w:rPr>
+          <w:b/>
+          <w:bCs/>
+          <w:sz w:val="26"/>
+          <w:szCs w:val="28"/>
           <w:lang w:val="en-US"/>
         </w:rPr>
-        <w:t xml:space="preserve"> Let’s define a few terms:</w:t>
+        <w:t xml:space="preserve">Compile </w:t>
+      </w:r>
+      <w:r>
+        <w:rPr>
+          <w:b/>
+          <w:bCs/>
+          <w:sz w:val="26"/>
+          <w:szCs w:val="28"/>
+        </w:rPr>
+        <w:t>→</w:t>
+      </w:r>
+      <w:r>
+        <w:rPr>
+          <w:b/>
+          <w:bCs/>
+          <w:sz w:val="26"/>
+          <w:szCs w:val="28"/>
+        </w:rPr>
+        <w:t xml:space="preserve"> Stage </w:t>
+      </w:r>
+      <w:r>
+        <w:rPr>
+          <w:b/>
+          <w:bCs/>
+          <w:sz w:val="26"/>
+          <w:szCs w:val="28"/>
+        </w:rPr>
+        <w:t>→</w:t>
+      </w:r>
+      <w:r>
+        <w:rPr>
+          <w:b/>
+          <w:bCs/>
+          <w:sz w:val="26"/>
+          <w:szCs w:val="28"/>
+        </w:rPr>
+        <w:t xml:space="preserve"> Deploy</w:t>
+      </w:r>
+      <w:r>
+        <w:rPr>
+          <w:lang w:val="en-US"/>
+        </w:rPr>
+        <w:br/>
+      </w:r>
+      <w:r>
+        <w:rPr>
+          <w:lang w:val="en-US"/>
+        </w:rPr>
+        <w:t>Let’s define a few terms:</w:t>
       </w:r>
     </w:p>
     <w:p>
@@ -1283,7 +1329,13 @@
         <w:t>Development</w:t>
       </w:r>
       <w:r>
-        <w:t xml:space="preserve">: Where you write and test code on your own machine </w:t>
+        <w:t xml:space="preserve">: </w:t>
+      </w:r>
+      <w:r>
+        <w:tab/>
+      </w:r>
+      <w:r>
+        <w:t xml:space="preserve">Where you write and test code on your own machine </w:t>
       </w:r>
     </w:p>
     <w:p>
@@ -1302,7 +1354,31 @@
         <w:t>Staging</w:t>
       </w:r>
       <w:r>
-        <w:t>: A "dress rehearsal" environment that mimics production. You deploy here first</w:t>
+        <w:t xml:space="preserve">: </w:t>
+      </w:r>
+      <w:r>
+        <w:tab/>
+      </w:r>
+      <w:r>
+        <w:tab/>
+      </w:r>
+      <w:r>
+        <w:t xml:space="preserve">A "dress rehearsal" environment that mimics production. </w:t>
+      </w:r>
+      <w:r>
+        <w:br/>
+      </w:r>
+      <w:r>
+        <w:tab/>
+      </w:r>
+      <w:r>
+        <w:tab/>
+      </w:r>
+      <w:r>
+        <w:tab/>
+      </w:r>
+      <w:r>
+        <w:t>You deploy here first</w:t>
       </w:r>
       <w:r>
         <w:t>.</w:t>
@@ -1324,7 +1400,16 @@
         <w:t>Production</w:t>
       </w:r>
       <w:r>
-        <w:t>: The live environment users interact with.</w:t>
+        <w:t xml:space="preserve">: </w:t>
+      </w:r>
+      <w:r>
+        <w:tab/>
+      </w:r>
+      <w:r>
+        <w:tab/>
+      </w:r>
+      <w:r>
+        <w:t>The live environment users interact with.</w:t>
       </w:r>
     </w:p>
     <w:p/>
@@ -1333,7 +1418,10 @@
         <w:pStyle w:val="Heading3"/>
       </w:pPr>
       <w:r>
-        <w:t>Write a simple app</w:t>
+        <w:t>Use notepad to w</w:t>
+      </w:r>
+      <w:r>
+        <w:t>rite a simple app</w:t>
       </w:r>
       <w:r>
         <w:t xml:space="preserve"> </w:t>
@@ -1351,6 +1439,298 @@
     <w:p>
       <w:pPr>
         <w:pStyle w:val="Heading3"/>
+        <w:ind w:left="1854"/>
+        <w:rPr>
+          <w:rFonts w:ascii="Consolas" w:eastAsia="Times New Roman" w:hAnsi="Consolas" w:cs="Times New Roman"/>
+          <w:color w:val="000000"/>
+          <w:kern w:val="0"/>
+          <w:sz w:val="22"/>
+          <w:szCs w:val="22"/>
+          <w:lang w:eastAsia="en-GB"/>
+          <w14:ligatures w14:val="none"/>
+        </w:rPr>
+      </w:pPr>
+      <w:r>
+        <w:rPr>
+          <w:rFonts w:ascii="Consolas" w:eastAsia="Times New Roman" w:hAnsi="Consolas" w:cs="Times New Roman"/>
+          <w:color w:val="000000"/>
+          <w:kern w:val="0"/>
+          <w:sz w:val="22"/>
+          <w:szCs w:val="22"/>
+          <w:lang w:eastAsia="en-GB"/>
+          <w14:ligatures w14:val="none"/>
+        </w:rPr>
+        <w:t xml:space="preserve">public </w:t>
+      </w:r>
+      <w:r>
+        <w:rPr>
+          <w:rFonts w:ascii="Consolas" w:eastAsia="Times New Roman" w:hAnsi="Consolas" w:cs="Times New Roman"/>
+          <w:color w:val="0000FF"/>
+          <w:kern w:val="0"/>
+          <w:sz w:val="22"/>
+          <w:szCs w:val="22"/>
+          <w:lang w:eastAsia="en-GB"/>
+          <w14:ligatures w14:val="none"/>
+        </w:rPr>
+        <w:t>class</w:t>
+      </w:r>
+      <w:r>
+        <w:rPr>
+          <w:rFonts w:ascii="Consolas" w:eastAsia="Times New Roman" w:hAnsi="Consolas" w:cs="Times New Roman"/>
+          <w:color w:val="000000"/>
+          <w:kern w:val="0"/>
+          <w:sz w:val="22"/>
+          <w:szCs w:val="22"/>
+          <w:lang w:eastAsia="en-GB"/>
+          <w14:ligatures w14:val="none"/>
+        </w:rPr>
+        <w:t xml:space="preserve"> HelloWorld {</w:t>
+      </w:r>
+    </w:p>
+    <w:p>
+      <w:pPr>
+        <w:shd w:val="clear" w:color="auto" w:fill="FFFFFF"/>
+        <w:spacing w:before="0" w:line="285" w:lineRule="atLeast"/>
+        <w:ind w:left="720"/>
+        <w:rPr>
+          <w:rFonts w:ascii="Consolas" w:eastAsia="Times New Roman" w:hAnsi="Consolas" w:cs="Times New Roman"/>
+          <w:b/>
+          <w:bCs/>
+          <w:color w:val="000000"/>
+          <w:kern w:val="0"/>
+          <w:sz w:val="22"/>
+          <w:szCs w:val="22"/>
+          <w:lang w:eastAsia="en-GB"/>
+          <w14:ligatures w14:val="none"/>
+        </w:rPr>
+      </w:pPr>
+      <w:r>
+        <w:rPr>
+          <w:rFonts w:ascii="Consolas" w:eastAsia="Times New Roman" w:hAnsi="Consolas" w:cs="Times New Roman"/>
+          <w:b/>
+          <w:bCs/>
+          <w:color w:val="000000"/>
+          <w:kern w:val="0"/>
+          <w:sz w:val="22"/>
+          <w:szCs w:val="22"/>
+          <w:lang w:eastAsia="en-GB"/>
+          <w14:ligatures w14:val="none"/>
+        </w:rPr>
+        <w:t xml:space="preserve">    </w:t>
+      </w:r>
+      <w:r>
+        <w:rPr>
+          <w:rFonts w:ascii="Consolas" w:eastAsia="Times New Roman" w:hAnsi="Consolas" w:cs="Times New Roman"/>
+          <w:b/>
+          <w:bCs/>
+          <w:color w:val="0000FF"/>
+          <w:kern w:val="0"/>
+          <w:sz w:val="22"/>
+          <w:szCs w:val="22"/>
+          <w:lang w:eastAsia="en-GB"/>
+          <w14:ligatures w14:val="none"/>
+        </w:rPr>
+        <w:t>public</w:t>
+      </w:r>
+      <w:r>
+        <w:rPr>
+          <w:rFonts w:ascii="Consolas" w:eastAsia="Times New Roman" w:hAnsi="Consolas" w:cs="Times New Roman"/>
+          <w:b/>
+          <w:bCs/>
+          <w:color w:val="000000"/>
+          <w:kern w:val="0"/>
+          <w:sz w:val="22"/>
+          <w:szCs w:val="22"/>
+          <w:lang w:eastAsia="en-GB"/>
+          <w14:ligatures w14:val="none"/>
+        </w:rPr>
+        <w:t xml:space="preserve"> </w:t>
+      </w:r>
+      <w:r>
+        <w:rPr>
+          <w:rFonts w:ascii="Consolas" w:eastAsia="Times New Roman" w:hAnsi="Consolas" w:cs="Times New Roman"/>
+          <w:b/>
+          <w:bCs/>
+          <w:color w:val="0000FF"/>
+          <w:kern w:val="0"/>
+          <w:sz w:val="22"/>
+          <w:szCs w:val="22"/>
+          <w:lang w:eastAsia="en-GB"/>
+          <w14:ligatures w14:val="none"/>
+        </w:rPr>
+        <w:t>static</w:t>
+      </w:r>
+      <w:r>
+        <w:rPr>
+          <w:rFonts w:ascii="Consolas" w:eastAsia="Times New Roman" w:hAnsi="Consolas" w:cs="Times New Roman"/>
+          <w:b/>
+          <w:bCs/>
+          <w:color w:val="000000"/>
+          <w:kern w:val="0"/>
+          <w:sz w:val="22"/>
+          <w:szCs w:val="22"/>
+          <w:lang w:eastAsia="en-GB"/>
+          <w14:ligatures w14:val="none"/>
+        </w:rPr>
+        <w:t xml:space="preserve"> </w:t>
+      </w:r>
+      <w:r>
+        <w:rPr>
+          <w:rFonts w:ascii="Consolas" w:eastAsia="Times New Roman" w:hAnsi="Consolas" w:cs="Times New Roman"/>
+          <w:b/>
+          <w:bCs/>
+          <w:color w:val="0000FF"/>
+          <w:kern w:val="0"/>
+          <w:sz w:val="22"/>
+          <w:szCs w:val="22"/>
+          <w:lang w:eastAsia="en-GB"/>
+          <w14:ligatures w14:val="none"/>
+        </w:rPr>
+        <w:t>void</w:t>
+      </w:r>
+      <w:r>
+        <w:rPr>
+          <w:rFonts w:ascii="Consolas" w:eastAsia="Times New Roman" w:hAnsi="Consolas" w:cs="Times New Roman"/>
+          <w:b/>
+          <w:bCs/>
+          <w:color w:val="000000"/>
+          <w:kern w:val="0"/>
+          <w:sz w:val="22"/>
+          <w:szCs w:val="22"/>
+          <w:lang w:eastAsia="en-GB"/>
+          <w14:ligatures w14:val="none"/>
+        </w:rPr>
+        <w:t xml:space="preserve"> main(String[] args) {</w:t>
+      </w:r>
+    </w:p>
+    <w:p>
+      <w:pPr>
+        <w:shd w:val="clear" w:color="auto" w:fill="FFFFFF"/>
+        <w:spacing w:before="0" w:line="285" w:lineRule="atLeast"/>
+        <w:ind w:left="720"/>
+        <w:rPr>
+          <w:rFonts w:ascii="Consolas" w:eastAsia="Times New Roman" w:hAnsi="Consolas" w:cs="Times New Roman"/>
+          <w:b/>
+          <w:bCs/>
+          <w:color w:val="000000"/>
+          <w:kern w:val="0"/>
+          <w:sz w:val="22"/>
+          <w:szCs w:val="22"/>
+          <w:lang w:eastAsia="en-GB"/>
+          <w14:ligatures w14:val="none"/>
+        </w:rPr>
+      </w:pPr>
+      <w:r>
+        <w:rPr>
+          <w:rFonts w:ascii="Consolas" w:eastAsia="Times New Roman" w:hAnsi="Consolas" w:cs="Times New Roman"/>
+          <w:b/>
+          <w:bCs/>
+          <w:color w:val="000000"/>
+          <w:kern w:val="0"/>
+          <w:sz w:val="22"/>
+          <w:szCs w:val="22"/>
+          <w:lang w:eastAsia="en-GB"/>
+          <w14:ligatures w14:val="none"/>
+        </w:rPr>
+        <w:t>        System.out.println(</w:t>
+      </w:r>
+      <w:r>
+        <w:rPr>
+          <w:rFonts w:ascii="Consolas" w:eastAsia="Times New Roman" w:hAnsi="Consolas" w:cs="Times New Roman"/>
+          <w:b/>
+          <w:bCs/>
+          <w:color w:val="A31515"/>
+          <w:kern w:val="0"/>
+          <w:sz w:val="22"/>
+          <w:szCs w:val="22"/>
+          <w:lang w:eastAsia="en-GB"/>
+          <w14:ligatures w14:val="none"/>
+        </w:rPr>
+        <w:t>"Hello, World!"</w:t>
+      </w:r>
+      <w:r>
+        <w:rPr>
+          <w:rFonts w:ascii="Consolas" w:eastAsia="Times New Roman" w:hAnsi="Consolas" w:cs="Times New Roman"/>
+          <w:b/>
+          <w:bCs/>
+          <w:color w:val="000000"/>
+          <w:kern w:val="0"/>
+          <w:sz w:val="22"/>
+          <w:szCs w:val="22"/>
+          <w:lang w:eastAsia="en-GB"/>
+          <w14:ligatures w14:val="none"/>
+        </w:rPr>
+        <w:t>);</w:t>
+      </w:r>
+    </w:p>
+    <w:p>
+      <w:pPr>
+        <w:shd w:val="clear" w:color="auto" w:fill="FFFFFF"/>
+        <w:spacing w:before="0" w:line="285" w:lineRule="atLeast"/>
+        <w:ind w:left="720"/>
+        <w:rPr>
+          <w:rFonts w:ascii="Consolas" w:eastAsia="Times New Roman" w:hAnsi="Consolas" w:cs="Times New Roman"/>
+          <w:b/>
+          <w:bCs/>
+          <w:color w:val="000000"/>
+          <w:kern w:val="0"/>
+          <w:sz w:val="22"/>
+          <w:szCs w:val="22"/>
+          <w:lang w:eastAsia="en-GB"/>
+          <w14:ligatures w14:val="none"/>
+        </w:rPr>
+      </w:pPr>
+      <w:r>
+        <w:rPr>
+          <w:rFonts w:ascii="Consolas" w:eastAsia="Times New Roman" w:hAnsi="Consolas" w:cs="Times New Roman"/>
+          <w:b/>
+          <w:bCs/>
+          <w:color w:val="000000"/>
+          <w:kern w:val="0"/>
+          <w:sz w:val="22"/>
+          <w:szCs w:val="22"/>
+          <w:lang w:eastAsia="en-GB"/>
+          <w14:ligatures w14:val="none"/>
+        </w:rPr>
+        <w:t>    }</w:t>
+      </w:r>
+    </w:p>
+    <w:p>
+      <w:pPr>
+        <w:shd w:val="clear" w:color="auto" w:fill="FFFFFF"/>
+        <w:spacing w:before="0" w:line="285" w:lineRule="atLeast"/>
+        <w:ind w:left="720"/>
+        <w:rPr>
+          <w:rFonts w:ascii="Consolas" w:eastAsia="Times New Roman" w:hAnsi="Consolas" w:cs="Times New Roman"/>
+          <w:b/>
+          <w:bCs/>
+          <w:color w:val="000000"/>
+          <w:kern w:val="0"/>
+          <w:sz w:val="22"/>
+          <w:szCs w:val="22"/>
+          <w:lang w:eastAsia="en-GB"/>
+          <w14:ligatures w14:val="none"/>
+        </w:rPr>
+      </w:pPr>
+      <w:r>
+        <w:rPr>
+          <w:rFonts w:ascii="Consolas" w:eastAsia="Times New Roman" w:hAnsi="Consolas" w:cs="Times New Roman"/>
+          <w:b/>
+          <w:bCs/>
+          <w:color w:val="000000"/>
+          <w:kern w:val="0"/>
+          <w:sz w:val="22"/>
+          <w:szCs w:val="22"/>
+          <w:lang w:eastAsia="en-GB"/>
+          <w14:ligatures w14:val="none"/>
+        </w:rPr>
+        <w:t>}</w:t>
+      </w:r>
+    </w:p>
+    <w:p>
+      <w:pPr>
+        <w:shd w:val="clear" w:color="auto" w:fill="FFFFFF"/>
+        <w:spacing w:before="0" w:line="285" w:lineRule="atLeast"/>
         <w:rPr>
           <w:rFonts w:ascii="Consolas" w:eastAsia="Times New Roman" w:hAnsi="Consolas" w:cs="Times New Roman"/>
           <w:color w:val="000000"/>
@@ -1361,334 +1741,41 @@
           <w14:ligatures w14:val="none"/>
         </w:rPr>
       </w:pPr>
-      <w:r>
-        <w:rPr>
-          <w:rFonts w:ascii="Consolas" w:eastAsia="Times New Roman" w:hAnsi="Consolas" w:cs="Times New Roman"/>
-          <w:color w:val="000000"/>
-          <w:kern w:val="0"/>
-          <w:sz w:val="21"/>
-          <w:szCs w:val="21"/>
+    </w:p>
+    <w:p>
+      <w:pPr>
+        <w:pStyle w:val="Heading3"/>
+        <w:rPr>
           <w:lang w:eastAsia="en-GB"/>
-          <w14:ligatures w14:val="none"/>
-        </w:rPr>
-        <w:t xml:space="preserve">public </w:t>
-      </w:r>
-      <w:r>
-        <w:rPr>
-          <w:rFonts w:ascii="Consolas" w:eastAsia="Times New Roman" w:hAnsi="Consolas" w:cs="Times New Roman"/>
-          <w:color w:val="0000FF"/>
-          <w:kern w:val="0"/>
-          <w:sz w:val="21"/>
-          <w:szCs w:val="21"/>
+        </w:rPr>
+      </w:pPr>
+      <w:r>
+        <w:rPr>
           <w:lang w:eastAsia="en-GB"/>
-          <w14:ligatures w14:val="none"/>
-        </w:rPr>
-        <w:t>class</w:t>
-      </w:r>
-      <w:r>
-        <w:rPr>
-          <w:rFonts w:ascii="Consolas" w:eastAsia="Times New Roman" w:hAnsi="Consolas" w:cs="Times New Roman"/>
-          <w:color w:val="000000"/>
-          <w:kern w:val="0"/>
-          <w:sz w:val="21"/>
-          <w:szCs w:val="21"/>
+        </w:rPr>
+        <w:t>Use command line to:</w:t>
+      </w:r>
+    </w:p>
+    <w:p>
+      <w:pPr>
+        <w:pStyle w:val="Heading3"/>
+        <w:rPr>
           <w:lang w:eastAsia="en-GB"/>
-          <w14:ligatures w14:val="none"/>
-        </w:rPr>
-        <w:t xml:space="preserve"> HelloWorld {</w:t>
-      </w:r>
-    </w:p>
-    <w:p>
-      <w:pPr>
-        <w:shd w:val="clear" w:color="auto" w:fill="FFFFFF"/>
-        <w:spacing w:before="0" w:line="285" w:lineRule="atLeast"/>
-        <w:rPr>
-          <w:rFonts w:ascii="Consolas" w:eastAsia="Times New Roman" w:hAnsi="Consolas" w:cs="Times New Roman"/>
-          <w:color w:val="000000"/>
-          <w:kern w:val="0"/>
-          <w:sz w:val="21"/>
-          <w:szCs w:val="21"/>
+        </w:rPr>
+      </w:pPr>
+      <w:r>
+        <w:rPr>
           <w:lang w:eastAsia="en-GB"/>
-          <w14:ligatures w14:val="none"/>
-        </w:rPr>
-      </w:pPr>
-      <w:r>
-        <w:rPr>
-          <w:rFonts w:ascii="Consolas" w:eastAsia="Times New Roman" w:hAnsi="Consolas" w:cs="Times New Roman"/>
-          <w:color w:val="000000"/>
-          <w:kern w:val="0"/>
-          <w:sz w:val="21"/>
-          <w:szCs w:val="21"/>
-          <w:lang w:eastAsia="en-GB"/>
-          <w14:ligatures w14:val="none"/>
-        </w:rPr>
-        <w:t xml:space="preserve">    </w:t>
-      </w:r>
-      <w:r>
-        <w:rPr>
-          <w:rFonts w:ascii="Consolas" w:eastAsia="Times New Roman" w:hAnsi="Consolas" w:cs="Times New Roman"/>
-          <w:color w:val="0000FF"/>
-          <w:kern w:val="0"/>
-          <w:sz w:val="21"/>
-          <w:szCs w:val="21"/>
-          <w:lang w:eastAsia="en-GB"/>
-          <w14:ligatures w14:val="none"/>
-        </w:rPr>
-        <w:t>public</w:t>
-      </w:r>
-      <w:r>
-        <w:rPr>
-          <w:rFonts w:ascii="Consolas" w:eastAsia="Times New Roman" w:hAnsi="Consolas" w:cs="Times New Roman"/>
-          <w:color w:val="000000"/>
-          <w:kern w:val="0"/>
-          <w:sz w:val="21"/>
-          <w:szCs w:val="21"/>
-          <w:lang w:eastAsia="en-GB"/>
-          <w14:ligatures w14:val="none"/>
-        </w:rPr>
+        </w:rPr>
+        <w:t xml:space="preserve">Compile </w:t>
+      </w:r>
+      <w:r>
+        <w:t>→</w:t>
+      </w:r>
+      <w:r>
         <w:t xml:space="preserve"> </w:t>
       </w:r>
       <w:r>
-        <w:rPr>
-          <w:rFonts w:ascii="Consolas" w:eastAsia="Times New Roman" w:hAnsi="Consolas" w:cs="Times New Roman"/>
-          <w:color w:val="0000FF"/>
-          <w:kern w:val="0"/>
-          <w:sz w:val="21"/>
-          <w:szCs w:val="21"/>
-          <w:lang w:eastAsia="en-GB"/>
-          <w14:ligatures w14:val="none"/>
-        </w:rPr>
-        <w:t>static</w:t>
-      </w:r>
-      <w:r>
-        <w:rPr>
-          <w:rFonts w:ascii="Consolas" w:eastAsia="Times New Roman" w:hAnsi="Consolas" w:cs="Times New Roman"/>
-          <w:color w:val="000000"/>
-          <w:kern w:val="0"/>
-          <w:sz w:val="21"/>
-          <w:szCs w:val="21"/>
-          <w:lang w:eastAsia="en-GB"/>
-          <w14:ligatures w14:val="none"/>
-        </w:rPr>
-        <w:t xml:space="preserve"> </w:t>
-      </w:r>
-      <w:r>
-        <w:rPr>
-          <w:rFonts w:ascii="Consolas" w:eastAsia="Times New Roman" w:hAnsi="Consolas" w:cs="Times New Roman"/>
-          <w:color w:val="0000FF"/>
-          <w:kern w:val="0"/>
-          <w:sz w:val="21"/>
-          <w:szCs w:val="21"/>
-          <w:lang w:eastAsia="en-GB"/>
-          <w14:ligatures w14:val="none"/>
-        </w:rPr>
-        <w:t>void</w:t>
-      </w:r>
-      <w:r>
-        <w:rPr>
-          <w:rFonts w:ascii="Consolas" w:eastAsia="Times New Roman" w:hAnsi="Consolas" w:cs="Times New Roman"/>
-          <w:color w:val="000000"/>
-          <w:kern w:val="0"/>
-          <w:sz w:val="21"/>
-          <w:szCs w:val="21"/>
-          <w:lang w:eastAsia="en-GB"/>
-          <w14:ligatures w14:val="none"/>
-        </w:rPr>
-        <w:t xml:space="preserve"> main(String[] </w:t>
-      </w:r>
-      <w:proofErr w:type="spellStart"/>
-      <w:r>
-        <w:rPr>
-          <w:rFonts w:ascii="Consolas" w:eastAsia="Times New Roman" w:hAnsi="Consolas" w:cs="Times New Roman"/>
-          <w:color w:val="000000"/>
-          <w:kern w:val="0"/>
-          <w:sz w:val="21"/>
-          <w:szCs w:val="21"/>
-          <w:lang w:eastAsia="en-GB"/>
-          <w14:ligatures w14:val="none"/>
-        </w:rPr>
-        <w:t>args</w:t>
-      </w:r>
-      <w:proofErr w:type="spellEnd"/>
-      <w:r>
-        <w:rPr>
-          <w:rFonts w:ascii="Consolas" w:eastAsia="Times New Roman" w:hAnsi="Consolas" w:cs="Times New Roman"/>
-          <w:color w:val="000000"/>
-          <w:kern w:val="0"/>
-          <w:sz w:val="21"/>
-          <w:szCs w:val="21"/>
-          <w:lang w:eastAsia="en-GB"/>
-          <w14:ligatures w14:val="none"/>
-        </w:rPr>
-        <w:t>) {</w:t>
-      </w:r>
-    </w:p>
-    <w:p>
-      <w:pPr>
-        <w:shd w:val="clear" w:color="auto" w:fill="FFFFFF"/>
-        <w:spacing w:before="0" w:line="285" w:lineRule="atLeast"/>
-        <w:rPr>
-          <w:rFonts w:ascii="Consolas" w:eastAsia="Times New Roman" w:hAnsi="Consolas" w:cs="Times New Roman"/>
-          <w:color w:val="000000"/>
-          <w:kern w:val="0"/>
-          <w:sz w:val="21"/>
-          <w:szCs w:val="21"/>
-          <w:lang w:eastAsia="en-GB"/>
-          <w14:ligatures w14:val="none"/>
-        </w:rPr>
-      </w:pPr>
-      <w:r>
-        <w:rPr>
-          <w:rFonts w:ascii="Consolas" w:eastAsia="Times New Roman" w:hAnsi="Consolas" w:cs="Times New Roman"/>
-          <w:color w:val="000000"/>
-          <w:kern w:val="0"/>
-          <w:sz w:val="21"/>
-          <w:szCs w:val="21"/>
-          <w:lang w:eastAsia="en-GB"/>
-          <w14:ligatures w14:val="none"/>
-        </w:rPr>
-        <w:t xml:space="preserve">        </w:t>
-      </w:r>
-      <w:proofErr w:type="spellStart"/>
-      <w:r>
-        <w:rPr>
-          <w:rFonts w:ascii="Consolas" w:eastAsia="Times New Roman" w:hAnsi="Consolas" w:cs="Times New Roman"/>
-          <w:color w:val="000000"/>
-          <w:kern w:val="0"/>
-          <w:sz w:val="21"/>
-          <w:szCs w:val="21"/>
-          <w:lang w:eastAsia="en-GB"/>
-          <w14:ligatures w14:val="none"/>
-        </w:rPr>
-        <w:t>System.out.println</w:t>
-      </w:r>
-      <w:proofErr w:type="spellEnd"/>
-      <w:r>
-        <w:rPr>
-          <w:rFonts w:ascii="Consolas" w:eastAsia="Times New Roman" w:hAnsi="Consolas" w:cs="Times New Roman"/>
-          <w:color w:val="000000"/>
-          <w:kern w:val="0"/>
-          <w:sz w:val="21"/>
-          <w:szCs w:val="21"/>
-          <w:lang w:eastAsia="en-GB"/>
-          <w14:ligatures w14:val="none"/>
-        </w:rPr>
-        <w:t>(</w:t>
-      </w:r>
-      <w:r>
-        <w:rPr>
-          <w:rFonts w:ascii="Consolas" w:eastAsia="Times New Roman" w:hAnsi="Consolas" w:cs="Times New Roman"/>
-          <w:color w:val="A31515"/>
-          <w:kern w:val="0"/>
-          <w:sz w:val="21"/>
-          <w:szCs w:val="21"/>
-          <w:lang w:eastAsia="en-GB"/>
-          <w14:ligatures w14:val="none"/>
-        </w:rPr>
-        <w:t>"Hello, World!"</w:t>
-      </w:r>
-      <w:r>
-        <w:rPr>
-          <w:rFonts w:ascii="Consolas" w:eastAsia="Times New Roman" w:hAnsi="Consolas" w:cs="Times New Roman"/>
-          <w:color w:val="000000"/>
-          <w:kern w:val="0"/>
-          <w:sz w:val="21"/>
-          <w:szCs w:val="21"/>
-          <w:lang w:eastAsia="en-GB"/>
-          <w14:ligatures w14:val="none"/>
-        </w:rPr>
-        <w:t>);</w:t>
-      </w:r>
-    </w:p>
-    <w:p>
-      <w:pPr>
-        <w:shd w:val="clear" w:color="auto" w:fill="FFFFFF"/>
-        <w:spacing w:before="0" w:line="285" w:lineRule="atLeast"/>
-        <w:rPr>
-          <w:rFonts w:ascii="Consolas" w:eastAsia="Times New Roman" w:hAnsi="Consolas" w:cs="Times New Roman"/>
-          <w:color w:val="000000"/>
-          <w:kern w:val="0"/>
-          <w:sz w:val="21"/>
-          <w:szCs w:val="21"/>
-          <w:lang w:eastAsia="en-GB"/>
-          <w14:ligatures w14:val="none"/>
-        </w:rPr>
-      </w:pPr>
-      <w:r>
-        <w:rPr>
-          <w:rFonts w:ascii="Consolas" w:eastAsia="Times New Roman" w:hAnsi="Consolas" w:cs="Times New Roman"/>
-          <w:color w:val="000000"/>
-          <w:kern w:val="0"/>
-          <w:sz w:val="21"/>
-          <w:szCs w:val="21"/>
-          <w:lang w:eastAsia="en-GB"/>
-          <w14:ligatures w14:val="none"/>
-        </w:rPr>
-        <w:t>    }</w:t>
-      </w:r>
-    </w:p>
-    <w:p>
-      <w:pPr>
-        <w:shd w:val="clear" w:color="auto" w:fill="FFFFFF"/>
-        <w:spacing w:before="0" w:line="285" w:lineRule="atLeast"/>
-        <w:rPr>
-          <w:rFonts w:ascii="Consolas" w:eastAsia="Times New Roman" w:hAnsi="Consolas" w:cs="Times New Roman"/>
-          <w:color w:val="000000"/>
-          <w:kern w:val="0"/>
-          <w:sz w:val="21"/>
-          <w:szCs w:val="21"/>
-          <w:lang w:eastAsia="en-GB"/>
-          <w14:ligatures w14:val="none"/>
-        </w:rPr>
-      </w:pPr>
-      <w:r>
-        <w:rPr>
-          <w:rFonts w:ascii="Consolas" w:eastAsia="Times New Roman" w:hAnsi="Consolas" w:cs="Times New Roman"/>
-          <w:color w:val="000000"/>
-          <w:kern w:val="0"/>
-          <w:sz w:val="21"/>
-          <w:szCs w:val="21"/>
-          <w:lang w:eastAsia="en-GB"/>
-          <w14:ligatures w14:val="none"/>
-        </w:rPr>
-        <w:t>}</w:t>
-      </w:r>
-    </w:p>
-    <w:p>
-      <w:pPr>
-        <w:shd w:val="clear" w:color="auto" w:fill="FFFFFF"/>
-        <w:spacing w:before="0" w:line="285" w:lineRule="atLeast"/>
-        <w:rPr>
-          <w:rFonts w:ascii="Consolas" w:eastAsia="Times New Roman" w:hAnsi="Consolas" w:cs="Times New Roman"/>
-          <w:color w:val="000000"/>
-          <w:kern w:val="0"/>
-          <w:sz w:val="21"/>
-          <w:szCs w:val="21"/>
-          <w:lang w:eastAsia="en-GB"/>
-          <w14:ligatures w14:val="none"/>
-        </w:rPr>
-      </w:pPr>
-    </w:p>
-    <w:p>
-      <w:pPr>
-        <w:pStyle w:val="Heading3"/>
-        <w:rPr>
-          <w:lang w:eastAsia="en-GB"/>
-        </w:rPr>
-      </w:pPr>
-      <w:r>
-        <w:rPr>
-          <w:lang w:eastAsia="en-GB"/>
-        </w:rPr>
-        <w:t xml:space="preserve">Compile </w:t>
-      </w:r>
-      <w:r>
-        <w:t>→</w:t>
-      </w:r>
-      <w:r>
-        <w:t xml:space="preserve"> </w:t>
-      </w:r>
-      <w:r>
         <w:tab/>
       </w:r>
       <w:r>
@@ -1697,7 +1784,6 @@
       <w:r>
         <w:tab/>
       </w:r>
-      <w:proofErr w:type="spellStart"/>
       <w:r>
         <w:rPr>
           <w:color w:val="A80309" w:themeColor="accent4" w:themeShade="80"/>
@@ -1705,7 +1791,6 @@
         </w:rPr>
         <w:t>javac</w:t>
       </w:r>
-      <w:proofErr w:type="spellEnd"/>
       <w:r>
         <w:rPr>
           <w:color w:val="A80309" w:themeColor="accent4" w:themeShade="80"/>
@@ -1753,55 +1838,38 @@
           <w:color w:val="A80309" w:themeColor="accent4" w:themeShade="80"/>
           <w:lang w:eastAsia="en-GB"/>
         </w:rPr>
-        <w:t>java -</w:t>
-      </w:r>
-      <w:proofErr w:type="spellStart"/>
-      <w:r>
-        <w:rPr>
-          <w:color w:val="A80309" w:themeColor="accent4" w:themeShade="80"/>
+        <w:t>java -cfe</w:t>
+      </w:r>
+      <w:r>
+        <w:rPr>
           <w:lang w:eastAsia="en-GB"/>
         </w:rPr>
-        <w:t>cfe</w:t>
-      </w:r>
-      <w:proofErr w:type="spellEnd"/>
+        <w:t xml:space="preserve"> HelloWorld.jar </w:t>
+      </w:r>
       <w:r>
         <w:rPr>
           <w:lang w:eastAsia="en-GB"/>
         </w:rPr>
-        <w:t xml:space="preserve"> HelloWorld.jar </w:t>
+        <w:t xml:space="preserve"> </w:t>
       </w:r>
       <w:r>
         <w:rPr>
           <w:lang w:eastAsia="en-GB"/>
         </w:rPr>
+        <w:t>HelloWorld</w:t>
+      </w:r>
+      <w:r>
+        <w:rPr>
+          <w:lang w:eastAsia="en-GB"/>
+        </w:rPr>
         <w:t xml:space="preserve"> </w:t>
       </w:r>
       <w:r>
         <w:rPr>
           <w:lang w:eastAsia="en-GB"/>
         </w:rPr>
-        <w:t>HelloWorld</w:t>
-      </w:r>
-      <w:r>
-        <w:rPr>
-          <w:lang w:eastAsia="en-GB"/>
-        </w:rPr>
-        <w:t xml:space="preserve"> </w:t>
-      </w:r>
-      <w:r>
-        <w:rPr>
-          <w:lang w:eastAsia="en-GB"/>
-        </w:rPr>
-        <w:t xml:space="preserve"> </w:t>
-      </w:r>
-      <w:proofErr w:type="spellStart"/>
-      <w:r>
-        <w:rPr>
-          <w:lang w:eastAsia="en-GB"/>
-        </w:rPr>
-        <w:t>HelloWorld.class</w:t>
-      </w:r>
-      <w:proofErr w:type="spellEnd"/>
+        <w:t xml:space="preserve"> HelloWorld.class</w:t>
+      </w:r>
     </w:p>
     <w:p>
       <w:pPr>
@@ -4780,7 +4848,7 @@
         <w:rFonts w:ascii="Symbol" w:hAnsi="Symbol" w:hint="default"/>
       </w:rPr>
     </w:lvl>
-    <w:lvl w:ilvl="1" w:tplc="08090003" w:tentative="1">
+    <w:lvl w:ilvl="1" w:tplc="08090003">
       <w:start w:val="1"/>
       <w:numFmt w:val="bullet"/>
       <w:lvlText w:val="o"/>
@@ -6160,6 +6228,7 @@
   <w:style w:type="character" w:default="1" w:styleId="DefaultParagraphFont">
     <w:name w:val="Default Paragraph Font"/>
     <w:uiPriority w:val="1"/>
+    <w:semiHidden/>
     <w:unhideWhenUsed/>
   </w:style>
   <w:style w:type="table" w:default="1" w:styleId="TableNormal">
@@ -7808,21 +7877,6 @@
 </file>
 
 <file path=customXml/item1.xml><?xml version="1.0" encoding="utf-8"?>
-<p:properties xmlns:p="http://schemas.microsoft.com/office/2006/metadata/properties" xmlns:xsi="http://www.w3.org/2001/XMLSchema-instance" xmlns:pc="http://schemas.microsoft.com/office/infopath/2007/PartnerControls">
-  <documentManagement/>
-</p:properties>
-</file>
-
-<file path=customXml/item2.xml><?xml version="1.0" encoding="utf-8"?>
-<?mso-contentType ?>
-<FormTemplates xmlns="http://schemas.microsoft.com/sharepoint/v3/contenttype/forms">
-  <Display>DocumentLibraryForm</Display>
-  <Edit>DocumentLibraryForm</Edit>
-  <New>DocumentLibraryForm</New>
-</FormTemplates>
-</file>
-
-<file path=customXml/item3.xml><?xml version="1.0" encoding="utf-8"?>
 <ct:contentTypeSchema xmlns:ct="http://schemas.microsoft.com/office/2006/metadata/contentType" xmlns:ma="http://schemas.microsoft.com/office/2006/metadata/properties/metaAttributes" ct:_="" ma:_="" ma:contentTypeName="Document" ma:contentTypeID="0x010100074FAAA7972F9643A241C47A4640F77B" ma:contentTypeVersion="4" ma:contentTypeDescription="Create a new document." ma:contentTypeScope="" ma:versionID="beb1a33ce099b8336a535a8070a49028">
   <xsd:schema xmlns:xsd="http://www.w3.org/2001/XMLSchema" xmlns:xs="http://www.w3.org/2001/XMLSchema" xmlns:p="http://schemas.microsoft.com/office/2006/metadata/properties" xmlns:ns2="e3bcef54-3dd5-4c54-ac74-22a6c715abc5" targetNamespace="http://schemas.microsoft.com/office/2006/metadata/properties" ma:root="true" ma:fieldsID="39dc725c7e5b7c9c602767014e9452a2" ns2:_="">
     <xsd:import namespace="e3bcef54-3dd5-4c54-ac74-22a6c715abc5"/>
@@ -7966,28 +8020,26 @@
 </ct:contentTypeSchema>
 </file>
 
+<file path=customXml/item2.xml><?xml version="1.0" encoding="utf-8"?>
+<?mso-contentType ?>
+<FormTemplates xmlns="http://schemas.microsoft.com/sharepoint/v3/contenttype/forms">
+  <Display>DocumentLibraryForm</Display>
+  <Edit>DocumentLibraryForm</Edit>
+  <New>DocumentLibraryForm</New>
+</FormTemplates>
+</file>
+
+<file path=customXml/item3.xml><?xml version="1.0" encoding="utf-8"?>
+<p:properties xmlns:p="http://schemas.microsoft.com/office/2006/metadata/properties" xmlns:xsi="http://www.w3.org/2001/XMLSchema-instance" xmlns:pc="http://schemas.microsoft.com/office/infopath/2007/PartnerControls">
+  <documentManagement/>
+</p:properties>
+</file>
+
 <file path=customXml/item4.xml><?xml version="1.0" encoding="utf-8"?>
 <b:Sources xmlns:b="http://schemas.openxmlformats.org/officeDocument/2006/bibliography" xmlns="http://schemas.openxmlformats.org/officeDocument/2006/bibliography" SelectedStyle="\APASixthEditionOfficeOnline.xsl" StyleName="APA" Version="6"/>
 </file>
 
 <file path=customXml/itemProps1.xml><?xml version="1.0" encoding="utf-8"?>
-<ds:datastoreItem xmlns:ds="http://schemas.openxmlformats.org/officeDocument/2006/customXml" ds:itemID="{6367B603-3B12-42EB-A71C-92DF23C6A36D}">
-  <ds:schemaRefs>
-    <ds:schemaRef ds:uri="http://schemas.microsoft.com/office/2006/metadata/properties"/>
-    <ds:schemaRef ds:uri="http://schemas.microsoft.com/office/infopath/2007/PartnerControls"/>
-  </ds:schemaRefs>
-</ds:datastoreItem>
-</file>
-
-<file path=customXml/itemProps2.xml><?xml version="1.0" encoding="utf-8"?>
-<ds:datastoreItem xmlns:ds="http://schemas.openxmlformats.org/officeDocument/2006/customXml" ds:itemID="{1EF956C6-2A7C-438B-ACF2-9A85252697A5}">
-  <ds:schemaRefs>
-    <ds:schemaRef ds:uri="http://schemas.microsoft.com/sharepoint/v3/contenttype/forms"/>
-  </ds:schemaRefs>
-</ds:datastoreItem>
-</file>
-
-<file path=customXml/itemProps3.xml><?xml version="1.0" encoding="utf-8"?>
 <ds:datastoreItem xmlns:ds="http://schemas.openxmlformats.org/officeDocument/2006/customXml" ds:itemID="{8E875218-91D6-4204-B3E1-4F4C6E078F42}">
   <ds:schemaRefs>
     <ds:schemaRef ds:uri="http://schemas.microsoft.com/office/2006/metadata/contentType"/>
@@ -8005,6 +8057,23 @@
 </ds:datastoreItem>
 </file>
 
+<file path=customXml/itemProps2.xml><?xml version="1.0" encoding="utf-8"?>
+<ds:datastoreItem xmlns:ds="http://schemas.openxmlformats.org/officeDocument/2006/customXml" ds:itemID="{1EF956C6-2A7C-438B-ACF2-9A85252697A5}">
+  <ds:schemaRefs>
+    <ds:schemaRef ds:uri="http://schemas.microsoft.com/sharepoint/v3/contenttype/forms"/>
+  </ds:schemaRefs>
+</ds:datastoreItem>
+</file>
+
+<file path=customXml/itemProps3.xml><?xml version="1.0" encoding="utf-8"?>
+<ds:datastoreItem xmlns:ds="http://schemas.openxmlformats.org/officeDocument/2006/customXml" ds:itemID="{6367B603-3B12-42EB-A71C-92DF23C6A36D}">
+  <ds:schemaRefs>
+    <ds:schemaRef ds:uri="http://schemas.microsoft.com/office/2006/metadata/properties"/>
+    <ds:schemaRef ds:uri="http://schemas.microsoft.com/office/infopath/2007/PartnerControls"/>
+  </ds:schemaRefs>
+</ds:datastoreItem>
+</file>
+
 <file path=customXml/itemProps4.xml><?xml version="1.0" encoding="utf-8"?>
 <ds:datastoreItem xmlns:ds="http://schemas.openxmlformats.org/officeDocument/2006/customXml" ds:itemID="{F5997309-FACA-442A-8A47-89BAD725A418}">
   <ds:schemaRefs>

</xml_diff>